<commit_message>
Correct the Madon reference year and record reference checks
The EJISDC article is 2005, not 2004. Adds the DPR DOI, and updates the
verification report with which references were confirmed online and
which still need checking.

Co-Authored-By: Claude Opus 5.5 <noreply@anthropic.com>
Claude-Session: https://claude.ai/code/session_01VnNxcjwaVkyyWzY2M71Xvg
</commit_message>
<xml_diff>
--- a/docs/paper/v18/E-Panchayat-Research-Paper-IEEE-v18.docx
+++ b/docs/paper/v18/E-Panchayat-Research-Paper-IEEE-v18.docx
@@ -14297,7 +14297,7 @@
           <w:sz w:val="16"/>
           <w:szCs w:val="16"/>
         </w:rPr>
-        <w:t>, vol. 20, no. 5, pp. 1–13, 2004.</w:t>
+        <w:t>, vol. 20, no. 5, pp. 1–13, 2005.</w:t>
       </w:r>
     </w:p>
     <w:p>
@@ -14577,7 +14577,7 @@
           <w:sz w:val="16"/>
           <w:szCs w:val="16"/>
         </w:rPr>
-        <w:t>, 2020, pp. 6769–6781.</w:t>
+        <w:t>, 2020, pp. 6769–6781, doi: 10.18653/v1/2020.emnlp-main.550.</w:t>
       </w:r>
     </w:p>
     <w:p>

</xml_diff>